<commit_message>
Surface rich Turn & Talk fields, derive Level-1 scaffolds, fix 5-3 flagship, backfill Unit 7 vocab
- lesson-renderer: resolveTurnTalk now keeps kernel/wordBank/extend/extendStems
  (listenFor stays teacher-only); renderTurnAndTalk shows Level 1 support
  (Start here kernel + bilingual stems + word-bank chips) and Level 2 extend
  prompt + stretch stems
- lesson-renderer: add deriveScaffold(); every Level-1 practice item now shows a
  short, type-aware, non-answer-giving hint (authored scaffold/hint wins)
- lessons/5-3-flagship: rounded practice to 5/4/3 + optional, added error-analysis,
  replaced off-topic net-folder with on-topic triangle/composite-area tasks
- scripts/backfill-unit7-vocab.mjs: +2 vocab terms each to 7-1..7-7 and 6-7 (now 6)
- regenerated notes.html/docx/pdf for all 74
</commit_message>
<xml_diff>
--- a/lessons/5-3-flagship/downloads/5-3-flagship-notes.docx
+++ b/lessons/5-3-flagship/downloads/5-3-flagship-notes.docx
@@ -2080,7 +2080,7 @@
           <w:sz w:val="21"/>
           <w:szCs w:val="21"/>
         </w:rPr>
-        <w:t xml:space="preserve">1. A triangle has an area of 24 sq ft and a base of 8 ft. What is the height?</w:t>
+        <w:t xml:space="preserve">1. A triangular sail has an area of 30 sq m and a height of 12 m. What is its base?</w:t>
       </w:r>
     </w:p>
     <w:p>
@@ -2093,7 +2093,7 @@
           <w:sz w:val="20"/>
           <w:szCs w:val="20"/>
         </w:rPr>
-        <w:t xml:space="preserve">A. 6 ft</w:t>
+        <w:t xml:space="preserve">A. 5 m</w:t>
       </w:r>
     </w:p>
     <w:p>
@@ -2106,7 +2106,7 @@
           <w:sz w:val="20"/>
           <w:szCs w:val="20"/>
         </w:rPr>
-        <w:t xml:space="preserve">B. 3 ft</w:t>
+        <w:t xml:space="preserve">B. 2.5 m</w:t>
       </w:r>
     </w:p>
     <w:p>
@@ -2119,7 +2119,7 @@
           <w:sz w:val="20"/>
           <w:szCs w:val="20"/>
         </w:rPr>
-        <w:t xml:space="preserve">C. 16 ft</w:t>
+        <w:t xml:space="preserve">C. 18 m</w:t>
       </w:r>
     </w:p>
     <w:p>
@@ -2132,7 +2132,7 @@
           <w:sz w:val="20"/>
           <w:szCs w:val="20"/>
         </w:rPr>
-        <w:t xml:space="preserve">D. 12 ft</w:t>
+        <w:t xml:space="preserve">D. 360 m</w:t>
       </w:r>
     </w:p>
     <w:p>
@@ -2179,7 +2179,7 @@
           <w:sz w:val="21"/>
           <w:szCs w:val="21"/>
         </w:rPr>
-        <w:t xml:space="preserve">2. What is the area of a triangle with base 14 ft and height 6 ft?</w:t>
+        <w:t xml:space="preserve">2. A composite logo is made of a rectangle (8 cm by 6 cm) with a triangle on top. The triangle has a base of 8 cm and a height of 5 cm. What is the total area of the logo?</w:t>
       </w:r>
     </w:p>
     <w:p>
@@ -2192,7 +2192,7 @@
           <w:sz w:val="20"/>
           <w:szCs w:val="20"/>
         </w:rPr>
-        <w:t xml:space="preserve">A. 42 sq ft</w:t>
+        <w:t xml:space="preserve">A. 68 sq cm</w:t>
       </w:r>
     </w:p>
     <w:p>
@@ -2205,7 +2205,7 @@
           <w:sz w:val="20"/>
           <w:szCs w:val="20"/>
         </w:rPr>
-        <w:t xml:space="preserve">B. 84 sq ft</w:t>
+        <w:t xml:space="preserve">B. 48 sq cm</w:t>
       </w:r>
     </w:p>
     <w:p>
@@ -2218,7 +2218,7 @@
           <w:sz w:val="20"/>
           <w:szCs w:val="20"/>
         </w:rPr>
-        <w:t xml:space="preserve">C. 20 sq ft</w:t>
+        <w:t xml:space="preserve">C. 88 sq cm</w:t>
       </w:r>
     </w:p>
     <w:p>
@@ -2231,7 +2231,7 @@
           <w:sz w:val="20"/>
           <w:szCs w:val="20"/>
         </w:rPr>
-        <w:t xml:space="preserve">D. 42 ft</w:t>
+        <w:t xml:space="preserve">D. 58 sq cm</w:t>
       </w:r>
     </w:p>
     <w:p>
@@ -2430,17 +2430,17 @@
           <w:sz w:val="21"/>
           <w:szCs w:val="21"/>
         </w:rPr>
-        <w:t xml:space="preserve">A. 6 ft</w:t>
-      </w:r>
-      <w:r>
-        <w:rPr>
-          <w:i/>
-          <w:iCs/>
-          <w:color w:val="5F6F80"/>
-          <w:sz w:val="19"/>
-          <w:szCs w:val="19"/>
-        </w:rPr>
-        <w:t xml:space="preserve">  — 24 = ½ × 8 × h → 24 = 4h → h = 6 ft.</w:t>
+        <w:t xml:space="preserve">A. 5 m</w:t>
+      </w:r>
+      <w:r>
+        <w:rPr>
+          <w:i/>
+          <w:iCs/>
+          <w:color w:val="5F6F80"/>
+          <w:sz w:val="19"/>
+          <w:szCs w:val="19"/>
+        </w:rPr>
+        <w:t xml:space="preserve">  — 30 = ½ × b × 12 → 30 = 6b → b = 5 m.</w:t>
       </w:r>
     </w:p>
     <w:p>
@@ -2461,17 +2461,17 @@
           <w:sz w:val="21"/>
           <w:szCs w:val="21"/>
         </w:rPr>
-        <w:t xml:space="preserve">A. 42 sq ft</w:t>
-      </w:r>
-      <w:r>
-        <w:rPr>
-          <w:i/>
-          <w:iCs/>
-          <w:color w:val="5F6F80"/>
-          <w:sz w:val="19"/>
-          <w:szCs w:val="19"/>
-        </w:rPr>
-        <w:t xml:space="preserve">  — A = ½ × 14 × 6 = ½ × 84 = 42 sq ft.</w:t>
+        <w:t xml:space="preserve">A. 68 sq cm</w:t>
+      </w:r>
+      <w:r>
+        <w:rPr>
+          <w:i/>
+          <w:iCs/>
+          <w:color w:val="5F6F80"/>
+          <w:sz w:val="19"/>
+          <w:szCs w:val="19"/>
+        </w:rPr>
+        <w:t xml:space="preserve">  — Rectangle: 8 × 6 = 48 sq cm. Triangle: ½ × 8 × 5 = 20 sq cm. Total: 48 + 20 = 68 sq cm.</w:t>
       </w:r>
     </w:p>
     <w:p>

</xml_diff>